<commit_message>
Nieuwe set van veertien: Scrum toegevoegd op 03, hernummering verwerkt
</commit_message>
<xml_diff>
--- a/bestanden/01_Projectaanpak.docx
+++ b/bestanden/01_Projectaanpak.docx
@@ -1212,7 +1212,7 @@
                 <w:szCs w:val="18"/>
                 <w:lang w:val="nl-NL"/>
               </w:rPr>
-              <w:t xml:space="preserve">03, 04, 05</w:t>
+              <w:t xml:space="preserve">04, 05, 06</w:t>
             </w:r>
           </w:p>
         </w:tc>
@@ -1347,7 +1347,7 @@
                 <w:szCs w:val="18"/>
                 <w:lang w:val="nl-NL"/>
               </w:rPr>
-              <w:t xml:space="preserve">06, 07</w:t>
+              <w:t xml:space="preserve">07, 08</w:t>
             </w:r>
           </w:p>
         </w:tc>
@@ -1482,7 +1482,7 @@
                 <w:szCs w:val="18"/>
                 <w:lang w:val="nl-NL"/>
               </w:rPr>
-              <w:t xml:space="preserve">09, 10, 11</w:t>
+              <w:t xml:space="preserve">10, 11, 12</w:t>
             </w:r>
           </w:p>
         </w:tc>
@@ -1617,7 +1617,7 @@
                 <w:szCs w:val="18"/>
                 <w:lang w:val="nl-NL"/>
               </w:rPr>
-              <w:t xml:space="preserve">08</w:t>
+              <w:t xml:space="preserve">09</w:t>
             </w:r>
           </w:p>
         </w:tc>
@@ -1642,7 +1642,7 @@
         <w:rPr>
           <w:lang w:val="nl-NL"/>
         </w:rPr>
-        <w:t xml:space="preserve">Doorlopend gebruik je 02 Aanpakplan voor je richting, 12 Slim AI gebruiken voor je AI-werk en 13 Reflectie om terug te kijken.</w:t>
+        <w:t xml:space="preserve">Doorlopend gebruik je 02 Aanpakplan voor je richting, 03 Scrum &amp; kanban voor je ritme, 13 Slim AI gebruiken voor je AI-werk en 14 Reflectie om terug te kijken.</w:t>
       </w:r>
     </w:p>
     <w:tbl>

</xml_diff>